<commit_message>
Update CLAUDE.md + TASKS.md after session 1
</commit_message>
<xml_diff>
--- a/docs/kapitalertrag_documentation.docx
+++ b/docs/kapitalertrag_documentation.docx
@@ -7262,7 +7262,7 @@
                 <w:sz w:val="20"/>
                 <w:szCs w:val="20"/>
               </w:rPr>
-              <w:t xml:space="preserve">Label used in output filenames (default: self). Use different labels for each person.</w:t>
+              <w:t xml:space="preserve">Label used in output filenames. Default: auto — detected from account ID via account_map in config.yaml. Override only if auto-detection is wrong.</w:t>
             </w:r>
           </w:p>
         </w:tc>
@@ -9336,6 +9336,102 @@
           <w:szCs w:val="20"/>
         </w:rPr>
         <w:t xml:space="preserve">  NL: 0.15</w:t>
+      </w:r>
+    </w:p>
+    <w:p>
+      <w:pPr>
+        <w:shd w:fill="F5F5F5" w:val="clear"/>
+        <w:spacing w:after="40" w:before="40"/>
+        <w:ind w:left="720"/>
+      </w:pPr>
+      <w:r>
+        <w:rPr>
+          <w:rFonts w:ascii="Courier New" w:cs="Courier New" w:eastAsia="Courier New" w:hAnsi="Courier New"/>
+          <w:color w:val="404040"/>
+          <w:sz w:val="20"/>
+          <w:szCs w:val="20"/>
+        </w:rPr>
+        <w:t xml:space="preserve"/>
+      </w:r>
+    </w:p>
+    <w:p>
+      <w:pPr>
+        <w:shd w:fill="F5F5F5" w:val="clear"/>
+        <w:spacing w:after="40" w:before="40"/>
+        <w:ind w:left="720"/>
+      </w:pPr>
+      <w:r>
+        <w:rPr>
+          <w:rFonts w:ascii="Courier New" w:cs="Courier New" w:eastAsia="Courier New" w:hAnsi="Courier New"/>
+          <w:color w:val="404040"/>
+          <w:sz w:val="20"/>
+          <w:szCs w:val="20"/>
+        </w:rPr>
+        <w:t xml:space="preserve"># Account ID to person name mapping (auto-detects --person)</w:t>
+      </w:r>
+    </w:p>
+    <w:p>
+      <w:pPr>
+        <w:shd w:fill="F5F5F5" w:val="clear"/>
+        <w:spacing w:after="40" w:before="40"/>
+        <w:ind w:left="720"/>
+      </w:pPr>
+      <w:r>
+        <w:rPr>
+          <w:rFonts w:ascii="Courier New" w:cs="Courier New" w:eastAsia="Courier New" w:hAnsi="Courier New"/>
+          <w:color w:val="404040"/>
+          <w:sz w:val="20"/>
+          <w:szCs w:val="20"/>
+        </w:rPr>
+        <w:t xml:space="preserve"># Find your account ID in the BOF row of any IB Flex Query CSV</w:t>
+      </w:r>
+    </w:p>
+    <w:p>
+      <w:pPr>
+        <w:shd w:fill="F5F5F5" w:val="clear"/>
+        <w:spacing w:after="40" w:before="40"/>
+        <w:ind w:left="720"/>
+      </w:pPr>
+      <w:r>
+        <w:rPr>
+          <w:rFonts w:ascii="Courier New" w:cs="Courier New" w:eastAsia="Courier New" w:hAnsi="Courier New"/>
+          <w:color w:val="404040"/>
+          <w:sz w:val="20"/>
+          <w:szCs w:val="20"/>
+        </w:rPr>
+        <w:t xml:space="preserve">account_map:</w:t>
+      </w:r>
+    </w:p>
+    <w:p>
+      <w:pPr>
+        <w:shd w:fill="F5F5F5" w:val="clear"/>
+        <w:spacing w:after="40" w:before="40"/>
+        <w:ind w:left="720"/>
+      </w:pPr>
+      <w:r>
+        <w:rPr>
+          <w:rFonts w:ascii="Courier New" w:cs="Courier New" w:eastAsia="Courier New" w:hAnsi="Courier New"/>
+          <w:color w:val="404040"/>
+          <w:sz w:val="20"/>
+          <w:szCs w:val="20"/>
+        </w:rPr>
+        <w:t xml:space="preserve">  U13650071: jessie</w:t>
+      </w:r>
+    </w:p>
+    <w:p>
+      <w:pPr>
+        <w:shd w:fill="F5F5F5" w:val="clear"/>
+        <w:spacing w:after="40" w:before="40"/>
+        <w:ind w:left="720"/>
+      </w:pPr>
+      <w:r>
+        <w:rPr>
+          <w:rFonts w:ascii="Courier New" w:cs="Courier New" w:eastAsia="Courier New" w:hAnsi="Courier New"/>
+          <w:color w:val="404040"/>
+          <w:sz w:val="20"/>
+          <w:szCs w:val="20"/>
+        </w:rPr>
+        <w:t xml:space="preserve">  U99999999: self    # replace with your actual account ID</w:t>
       </w:r>
     </w:p>
     <w:p>

</xml_diff>

<commit_message>
docs: explain --fetch-ibkr vs --force-fetch-ibkr distinction
Adds section 6.5 with a comparison table covering all four fetch flags
(activity + positions, normal + force). Updates the section 9 args table
to include the two positions flags and clarify the cache-skip vs
always-overwrite behaviour. Error 1001 guidance updated to note that
plain --fetch-ibkr is safe to re-run immediately after a cooldown.

Co-Authored-By: Claude Sonnet 4.6 <noreply@anthropic.com>
</commit_message>
<xml_diff>
--- a/docs/kapitalertrag_documentation.docx
+++ b/docs/kapitalertrag_documentation.docx
@@ -3038,12 +3038,12 @@
           <w:color w:val="242424"/>
           <w:sz w:val="17"/>
         </w:rPr>
-        <w:t># Fetch + run in one step</w:t>
+        <w:t># Fetch + run in one step (skips download if file already exists)</w:t>
         <w:br/>
         <w:t>python main.py --person matthias --year 2025 --fetch-ibkr</w:t>
         <w:br/>
         <w:br/>
-        <w:t># Force re-download even if file already exists today</w:t>
+        <w:t># Force re-download even if a file already exists</w:t>
         <w:br/>
         <w:t>python main.py --person matthias --year 2025 --force-fetch-ibkr</w:t>
       </w:r>
@@ -3070,6 +3070,305 @@
       </w:r>
     </w:p>
     <w:p>
+      <w:pPr>
+        <w:pStyle w:val="Heading3"/>
+      </w:pPr>
+      <w:r>
+        <w:t>6.5 --fetch-ibkr vs --force-fetch-ibkr</w:t>
+      </w:r>
+    </w:p>
+    <w:tbl>
+      <w:tblPr>
+        <w:tblStyle w:val="TableGrid"/>
+        <w:tblW w:type="auto" w:w="0"/>
+        <w:tblLook w:firstColumn="1" w:firstRow="1" w:lastColumn="0" w:lastRow="0" w:noHBand="0" w:noVBand="1" w:val="04A0"/>
+      </w:tblPr>
+      <w:tblGrid>
+        <w:gridCol w:w="4680"/>
+        <w:gridCol w:w="4680"/>
+      </w:tblGrid>
+      <w:tr>
+        <w:tc>
+          <w:tcPr>
+            <w:tcW w:type="dxa" w:w="4680"/>
+            <w:shd w:val="clear" w:color="auto" w:fill="2E74B5"/>
+          </w:tcPr>
+          <w:p>
+            <w:pPr>
+              <w:spacing w:before="60" w:after="60"/>
+            </w:pPr>
+            <w:r>
+              <w:rPr>
+                <w:b/>
+                <w:color w:val="FFFFFF"/>
+                <w:sz w:val="18"/>
+              </w:rPr>
+              <w:t>Flag</w:t>
+            </w:r>
+          </w:p>
+        </w:tc>
+        <w:tc>
+          <w:tcPr>
+            <w:tcW w:type="dxa" w:w="4680"/>
+            <w:shd w:val="clear" w:color="auto" w:fill="2E74B5"/>
+          </w:tcPr>
+          <w:p>
+            <w:pPr>
+              <w:spacing w:before="60" w:after="60"/>
+            </w:pPr>
+            <w:r>
+              <w:rPr>
+                <w:b/>
+                <w:color w:val="FFFFFF"/>
+                <w:sz w:val="18"/>
+              </w:rPr>
+              <w:t>Behaviour</w:t>
+            </w:r>
+          </w:p>
+        </w:tc>
+      </w:tr>
+      <w:tr>
+        <w:tc>
+          <w:tcPr>
+            <w:tcW w:type="dxa" w:w="4680"/>
+          </w:tcPr>
+          <w:p>
+            <w:pPr>
+              <w:spacing w:before="40" w:after="40"/>
+            </w:pPr>
+            <w:r>
+              <w:rPr>
+                <w:rFonts w:ascii="Courier New" w:hAnsi="Courier New"/>
+                <w:color w:val="C02040"/>
+                <w:sz w:val="16"/>
+              </w:rPr>
+              <w:t>--fetch-ibkr</w:t>
+            </w:r>
+          </w:p>
+        </w:tc>
+        <w:tc>
+          <w:tcPr>
+            <w:tcW w:type="dxa" w:w="4680"/>
+          </w:tcPr>
+          <w:p>
+            <w:pPr>
+              <w:spacing w:before="40" w:after="40"/>
+            </w:pPr>
+            <w:r>
+              <w:rPr>
+                <w:sz w:val="18"/>
+              </w:rPr>
+              <w:t xml:space="preserve">Download from IBKR </w:t>
+            </w:r>
+            <w:r>
+              <w:rPr>
+                <w:b/>
+                <w:sz w:val="18"/>
+              </w:rPr>
+              <w:t>only if no file exists</w:t>
+            </w:r>
+            <w:r>
+              <w:rPr>
+                <w:sz w:val="18"/>
+              </w:rPr>
+              <w:t xml:space="preserve"> at the save path. If a previously downloaded file is present, it is reused silently. Safe to include in any run without risking rate-limit hits.</w:t>
+            </w:r>
+          </w:p>
+        </w:tc>
+      </w:tr>
+      <w:tr>
+        <w:tc>
+          <w:tcPr>
+            <w:tcW w:type="dxa" w:w="4680"/>
+            <w:shd w:val="clear" w:color="auto" w:fill="EBF3FB"/>
+          </w:tcPr>
+          <w:p>
+            <w:pPr>
+              <w:spacing w:before="40" w:after="40"/>
+            </w:pPr>
+            <w:r>
+              <w:rPr>
+                <w:rFonts w:ascii="Courier New" w:hAnsi="Courier New"/>
+                <w:color w:val="C02040"/>
+                <w:sz w:val="16"/>
+              </w:rPr>
+              <w:t>--force-fetch-ibkr</w:t>
+            </w:r>
+          </w:p>
+        </w:tc>
+        <w:tc>
+          <w:tcPr>
+            <w:tcW w:type="dxa" w:w="4680"/>
+            <w:shd w:val="clear" w:color="auto" w:fill="EBF3FB"/>
+          </w:tcPr>
+          <w:p>
+            <w:pPr>
+              <w:spacing w:before="40" w:after="40"/>
+            </w:pPr>
+            <w:r>
+              <w:rPr>
+                <w:b/>
+                <w:sz w:val="18"/>
+              </w:rPr>
+              <w:t>Always re-download</w:t>
+            </w:r>
+            <w:r>
+              <w:rPr>
+                <w:sz w:val="18"/>
+              </w:rPr>
+              <w:t xml:space="preserve">, overwriting any existing file. Use this when you need fresh data (e.g. you ran the tool earlier today and new transactions have since settled), or after changing the Flex Query layout in IBKR. Implies </w:t>
+            </w:r>
+            <w:r>
+              <w:rPr>
+                <w:rFonts w:ascii="Courier New" w:hAnsi="Courier New"/>
+                <w:color w:val="C02040"/>
+                <w:sz w:val="16"/>
+              </w:rPr>
+              <w:t>--fetch-ibkr</w:t>
+            </w:r>
+            <w:r>
+              <w:rPr>
+                <w:sz w:val="18"/>
+              </w:rPr>
+              <w:t>.</w:t>
+            </w:r>
+          </w:p>
+        </w:tc>
+      </w:tr>
+    </w:tbl>
+    <w:p/>
+    <w:p>
+      <w:r>
+        <w:t>The same logic applies to the Open Positions variants:</w:t>
+      </w:r>
+    </w:p>
+    <w:tbl>
+      <w:tblPr>
+        <w:tblStyle w:val="TableGrid"/>
+        <w:tblW w:type="auto" w:w="0"/>
+        <w:tblLook w:firstColumn="1" w:firstRow="1" w:lastColumn="0" w:lastRow="0" w:noHBand="0" w:noVBand="1" w:val="04A0"/>
+      </w:tblPr>
+      <w:tblGrid>
+        <w:gridCol w:w="4680"/>
+        <w:gridCol w:w="4680"/>
+      </w:tblGrid>
+      <w:tr>
+        <w:tc>
+          <w:tcPr>
+            <w:tcW w:type="dxa" w:w="4680"/>
+            <w:shd w:val="clear" w:color="auto" w:fill="2E74B5"/>
+          </w:tcPr>
+          <w:p>
+            <w:pPr>
+              <w:spacing w:before="60" w:after="60"/>
+            </w:pPr>
+            <w:r>
+              <w:rPr>
+                <w:b/>
+                <w:color w:val="FFFFFF"/>
+                <w:sz w:val="18"/>
+              </w:rPr>
+              <w:t>Flag</w:t>
+            </w:r>
+          </w:p>
+        </w:tc>
+        <w:tc>
+          <w:tcPr>
+            <w:tcW w:type="dxa" w:w="4680"/>
+            <w:shd w:val="clear" w:color="auto" w:fill="2E74B5"/>
+          </w:tcPr>
+          <w:p>
+            <w:pPr>
+              <w:spacing w:before="60" w:after="60"/>
+            </w:pPr>
+            <w:r>
+              <w:rPr>
+                <w:b/>
+                <w:color w:val="FFFFFF"/>
+                <w:sz w:val="18"/>
+              </w:rPr>
+              <w:t>Behaviour</w:t>
+            </w:r>
+          </w:p>
+        </w:tc>
+      </w:tr>
+      <w:tr>
+        <w:tc>
+          <w:tcPr>
+            <w:tcW w:type="dxa" w:w="4680"/>
+          </w:tcPr>
+          <w:p>
+            <w:pPr>
+              <w:spacing w:before="40" w:after="40"/>
+            </w:pPr>
+            <w:r>
+              <w:rPr>
+                <w:rFonts w:ascii="Courier New" w:hAnsi="Courier New"/>
+                <w:color w:val="C02040"/>
+                <w:sz w:val="16"/>
+              </w:rPr>
+              <w:t>--fetch-ibkr-positions</w:t>
+            </w:r>
+          </w:p>
+        </w:tc>
+        <w:tc>
+          <w:tcPr>
+            <w:tcW w:type="dxa" w:w="4680"/>
+          </w:tcPr>
+          <w:p>
+            <w:pPr>
+              <w:spacing w:before="40" w:after="40"/>
+            </w:pPr>
+            <w:r>
+              <w:rPr>
+                <w:sz w:val="18"/>
+              </w:rPr>
+              <w:t>Download Open Positions only if no cached file exists.</w:t>
+            </w:r>
+          </w:p>
+        </w:tc>
+      </w:tr>
+      <w:tr>
+        <w:tc>
+          <w:tcPr>
+            <w:tcW w:type="dxa" w:w="4680"/>
+            <w:shd w:val="clear" w:color="auto" w:fill="EBF3FB"/>
+          </w:tcPr>
+          <w:p>
+            <w:pPr>
+              <w:spacing w:before="40" w:after="40"/>
+            </w:pPr>
+            <w:r>
+              <w:rPr>
+                <w:rFonts w:ascii="Courier New" w:hAnsi="Courier New"/>
+                <w:color w:val="C02040"/>
+                <w:sz w:val="16"/>
+              </w:rPr>
+              <w:t>--force-fetch-ibkr-positions</w:t>
+            </w:r>
+          </w:p>
+        </w:tc>
+        <w:tc>
+          <w:tcPr>
+            <w:tcW w:type="dxa" w:w="4680"/>
+            <w:shd w:val="clear" w:color="auto" w:fill="EBF3FB"/>
+          </w:tcPr>
+          <w:p>
+            <w:pPr>
+              <w:spacing w:before="40" w:after="40"/>
+            </w:pPr>
+            <w:r>
+              <w:rPr>
+                <w:sz w:val="18"/>
+              </w:rPr>
+              <w:t>Always re-download Open Positions. Use after editing the Flex Query or when portfolio values look stale.</w:t>
+            </w:r>
+          </w:p>
+        </w:tc>
+      </w:tr>
+    </w:tbl>
+    <w:p/>
+    <w:p>
       <w:r>
         <w:rPr>
           <w:b/>
@@ -3077,7 +3376,39 @@
         <w:t>Error 1001</w:t>
       </w:r>
       <w:r>
-        <w:t>: IBKR enforces a ~10-minute cooldown between consecutive fetches. Wait and retry.</w:t>
+        <w:t>: IBKR enforces a ~10-minute cooldown between consecutive fetches. If you hit it,</w:t>
+      </w:r>
+    </w:p>
+    <w:p>
+      <w:r>
+        <w:t xml:space="preserve">wait 10 minutes and re-run with </w:t>
+      </w:r>
+      <w:r>
+        <w:rPr>
+          <w:rFonts w:ascii="Courier New" w:hAnsi="Courier New"/>
+          <w:color w:val="C02040"/>
+          <w:sz w:val="20"/>
+        </w:rPr>
+        <w:t>--force-fetch-ibkr</w:t>
+      </w:r>
+      <w:r>
+        <w:t xml:space="preserve">. Using plain </w:t>
+      </w:r>
+      <w:r>
+        <w:rPr>
+          <w:rFonts w:ascii="Courier New" w:hAnsi="Courier New"/>
+          <w:color w:val="C02040"/>
+          <w:sz w:val="20"/>
+        </w:rPr>
+        <w:t>--fetch-ibkr</w:t>
+      </w:r>
+      <w:r>
+        <w:t xml:space="preserve"> will not</w:t>
+      </w:r>
+    </w:p>
+    <w:p>
+      <w:r>
+        <w:t>trigger a new fetch (the existing file is reused), so it is safe to run immediately.</w:t>
       </w:r>
     </w:p>
     <w:p>
@@ -4344,7 +4675,7 @@
               <w:rPr>
                 <w:sz w:val="18"/>
               </w:rPr>
-              <w:t xml:space="preserve">Fetch IBKR Flex data automatically before running. Requires </w:t>
+              <w:t xml:space="preserve">Download IBKR Flex report if no cached file exists. Requires </w:t>
             </w:r>
             <w:r>
               <w:rPr>
@@ -4394,7 +4725,109 @@
               <w:rPr>
                 <w:sz w:val="18"/>
               </w:rPr>
-              <w:t>Force re-download even if file exists today.</w:t>
+              <w:t xml:space="preserve">Always re-download IBKR Flex report, overwriting any cached file. Implies </w:t>
+            </w:r>
+            <w:r>
+              <w:rPr>
+                <w:rFonts w:ascii="Courier New" w:hAnsi="Courier New"/>
+                <w:color w:val="C02040"/>
+                <w:sz w:val="16"/>
+              </w:rPr>
+              <w:t>--fetch-ibkr</w:t>
+            </w:r>
+            <w:r>
+              <w:rPr>
+                <w:sz w:val="18"/>
+              </w:rPr>
+              <w:t>.</w:t>
+            </w:r>
+          </w:p>
+        </w:tc>
+      </w:tr>
+      <w:tr>
+        <w:tc>
+          <w:tcPr>
+            <w:tcW w:type="dxa" w:w="4680"/>
+            <w:shd w:val="clear" w:color="auto" w:fill="EBF3FB"/>
+          </w:tcPr>
+          <w:p>
+            <w:pPr>
+              <w:spacing w:before="40" w:after="40"/>
+            </w:pPr>
+            <w:r>
+              <w:rPr>
+                <w:rFonts w:ascii="Courier New" w:hAnsi="Courier New"/>
+                <w:color w:val="C02040"/>
+                <w:sz w:val="16"/>
+              </w:rPr>
+              <w:t>--fetch-ibkr-positions</w:t>
+            </w:r>
+          </w:p>
+        </w:tc>
+        <w:tc>
+          <w:tcPr>
+            <w:tcW w:type="dxa" w:w="4680"/>
+            <w:shd w:val="clear" w:color="auto" w:fill="EBF3FB"/>
+          </w:tcPr>
+          <w:p>
+            <w:pPr>
+              <w:spacing w:before="40" w:after="40"/>
+            </w:pPr>
+            <w:r>
+              <w:rPr>
+                <w:sz w:val="18"/>
+              </w:rPr>
+              <w:t>Download Open Positions report if no cached file exists.</w:t>
+            </w:r>
+          </w:p>
+        </w:tc>
+      </w:tr>
+      <w:tr>
+        <w:tc>
+          <w:tcPr>
+            <w:tcW w:type="dxa" w:w="4680"/>
+          </w:tcPr>
+          <w:p>
+            <w:pPr>
+              <w:spacing w:before="40" w:after="40"/>
+            </w:pPr>
+            <w:r>
+              <w:rPr>
+                <w:rFonts w:ascii="Courier New" w:hAnsi="Courier New"/>
+                <w:color w:val="C02040"/>
+                <w:sz w:val="16"/>
+              </w:rPr>
+              <w:t>--force-fetch-ibkr-positions</w:t>
+            </w:r>
+          </w:p>
+        </w:tc>
+        <w:tc>
+          <w:tcPr>
+            <w:tcW w:type="dxa" w:w="4680"/>
+          </w:tcPr>
+          <w:p>
+            <w:pPr>
+              <w:spacing w:before="40" w:after="40"/>
+            </w:pPr>
+            <w:r>
+              <w:rPr>
+                <w:sz w:val="18"/>
+              </w:rPr>
+              <w:t xml:space="preserve">Always re-download Open Positions report. Implies </w:t>
+            </w:r>
+            <w:r>
+              <w:rPr>
+                <w:rFonts w:ascii="Courier New" w:hAnsi="Courier New"/>
+                <w:color w:val="C02040"/>
+                <w:sz w:val="16"/>
+              </w:rPr>
+              <w:t>--fetch-ibkr-positions</w:t>
+            </w:r>
+            <w:r>
+              <w:rPr>
+                <w:sz w:val="18"/>
+              </w:rPr>
+              <w:t>.</w:t>
             </w:r>
           </w:p>
         </w:tc>

</xml_diff>